<commit_message>
doc with beep wiring
</commit_message>
<xml_diff>
--- a/Documents/TrayAgitator Build Doc.docx
+++ b/Documents/TrayAgitator Build Doc.docx
@@ -51,6 +51,9 @@
     </w:p>
     <w:p>
       <w:r>
+        <w:rPr>
+          <w:noProof/>
+        </w:rPr>
         <w:drawing>
           <wp:inline distT="0" distB="0" distL="0" distR="0" wp14:anchorId="40462574" wp14:editId="5A85AC43">
             <wp:extent cx="5268892" cy="4078090"/>
@@ -144,6 +147,9 @@
     <w:p/>
     <w:p>
       <w:r>
+        <w:rPr>
+          <w:noProof/>
+        </w:rPr>
         <w:drawing>
           <wp:inline distT="0" distB="0" distL="0" distR="0" wp14:anchorId="22B8AD93" wp14:editId="214ED628">
             <wp:extent cx="5465674" cy="4118137"/>
@@ -182,6 +188,35 @@
       </w:r>
     </w:p>
     <w:p/>
+    <w:p>
+      <w:r>
+        <w:t>Beep</w:t>
+      </w:r>
+    </w:p>
+    <w:p>
+      <w:hyperlink r:id="rId9" w:history="1">
+        <w:r>
+          <w:rPr>
+            <w:rStyle w:val="Hyperlink"/>
+          </w:rPr>
+          <w:t>https://docs.sunfounder.com/projects/esp32-starter-kit/en/latest/arduino/basic_projects/ar_ac</w:t>
+        </w:r>
+        <w:r>
+          <w:rPr>
+            <w:rStyle w:val="Hyperlink"/>
+          </w:rPr>
+          <w:t>_</w:t>
+        </w:r>
+        <w:r>
+          <w:rPr>
+            <w:rStyle w:val="Hyperlink"/>
+          </w:rPr>
+          <w:t>buz.html</w:t>
+        </w:r>
+      </w:hyperlink>
+    </w:p>
+    <w:p/>
+    <w:p/>
     <w:p/>
     <w:p>
       <w:r>
@@ -204,7 +239,7 @@
                     <pic:cNvPicPr/>
                   </pic:nvPicPr>
                   <pic:blipFill>
-                    <a:blip r:embed="rId9" cstate="print">
+                    <a:blip r:embed="rId10" cstate="print">
                       <a:extLst>
                         <a:ext uri="{28A0092B-C50C-407E-A947-70E740481C1C}">
                           <a14:useLocalDpi xmlns:a14="http://schemas.microsoft.com/office/drawing/2010/main" val="0"/>
@@ -1181,6 +1216,18 @@
       <w:shd w:val="clear" w:color="auto" w:fill="E1DFDD"/>
     </w:rPr>
   </w:style>
+  <w:style w:type="character" w:styleId="FollowedHyperlink">
+    <w:name w:val="FollowedHyperlink"/>
+    <w:basedOn w:val="DefaultParagraphFont"/>
+    <w:uiPriority w:val="99"/>
+    <w:semiHidden/>
+    <w:unhideWhenUsed/>
+    <w:rsid w:val="00CA71FA"/>
+    <w:rPr>
+      <w:color w:val="96607D" w:themeColor="followedHyperlink"/>
+      <w:u w:val="single"/>
+    </w:rPr>
+  </w:style>
 </w:styles>
 </file>
 

</xml_diff>